<commit_message>
docs: finalize v0.12.2 publication records
</commit_message>
<xml_diff>
--- a/DeepSeek-Agent-V3-工作日志-0.12.2.docx
+++ b/DeepSeek-Agent-V3-工作日志-0.12.2.docx
@@ -27,7 +27,7 @@
           <w:rFonts w:ascii="Arial" w:hAnsi="Arial" w:eastAsia="Microsoft YaHei"/>
           <w:sz w:val="21"/>
         </w:rPr>
-        <w:t>状态：v0.12.1 已完整推送且 Actions 全绿，但 GitHub 根目录仍残留两份 0.10.0 Word，导致用户在仓库首页看到旧工作日志。v0.12.2 正在统一根目录与 `user-docs/` 的当前文档入口，并加入防回归测试。本补丁不改 Runtime/schema，不读取 Key，不调用 DeepSeek API。</w:t>
+        <w:t>状态：v0.12.1 已完整推送且 Actions 全绿，但 GitHub 根目录仍残留两份 0.10.0 Word，导致用户在仓库首页看到旧工作日志。v0.12.2 已统一根目录与 `user-docs/` 的当前文档入口，并加入防回归测试。实现提交 `c8d73790331776c98ce9cdb8d2141bb8dc0a6eee` 已推送，Actions run `30241601163` 在 Python 3.11/3.12/3.13 上均 504 passed。本补丁不改 Runtime/schema，不读取 Key，不调用 DeepSeek API。</w:t>
       </w:r>
     </w:p>
     <w:p/>
@@ -868,6 +868,8 @@
         <w:t>GitHub Actions Python 3.11/3.12/3.13：各 503 passed</w:t>
         <w:br/>
         <w:t>v0.12.2 发布布局/Word 聚焦回归：10 passed</w:t>
+        <w:br/>
+        <w:t>GitHub Actions v0.12.2 Python 3.11/3.12/3.13：各 504 passed</w:t>
       </w:r>
     </w:p>
     <w:p/>
@@ -1162,6 +1164,30 @@
           <w:sz w:val="21"/>
         </w:rPr>
         <w:t>v0.12.1 最终提交/tag：`eb111ad13357a45622c19d38d75efda8c5cfb0dc`，Actions run `30211093526` 成功</w:t>
+      </w:r>
+    </w:p>
+    <w:p>
+      <w:pPr>
+        <w:pStyle w:val="ListBullet"/>
+      </w:pPr>
+      <w:r>
+        <w:rPr>
+          <w:rFonts w:ascii="Arial" w:hAnsi="Arial" w:eastAsia="Microsoft YaHei"/>
+          <w:sz w:val="21"/>
+        </w:rPr>
+        <w:t>v0.12.2 实现与文档布局提交：`c8d73790331776c98ce9cdb8d2141bb8dc0a6eee`</w:t>
+      </w:r>
+    </w:p>
+    <w:p>
+      <w:pPr>
+        <w:pStyle w:val="ListBullet"/>
+      </w:pPr>
+      <w:r>
+        <w:rPr>
+          <w:rFonts w:ascii="Arial" w:hAnsi="Arial" w:eastAsia="Microsoft YaHei"/>
+          <w:sz w:val="21"/>
+        </w:rPr>
+        <w:t>v0.12.2 初次 GitHub 推送：成功；Actions run `30241601163` 成功，Python 3.11/3.12/3.13 的 Ruff、format、504 项测试和 compileall 全部通过</w:t>
       </w:r>
     </w:p>
     <w:p>

</xml_diff>